<commit_message>
update the format of resuma and improve it in better way
</commit_message>
<xml_diff>
--- a/public/resume.docx
+++ b/public/resume.docx
@@ -210,6 +210,14 @@
         </w:r>
         <w:r>
           <w:rPr>
+            <w:rFonts w:ascii="Arial" w:hAnsi="Arial" w:cs="Arial"/>
+            <w:color w:val="215868" w:themeColor="accent5" w:themeShade="80"/>
+            <w:sz w:val="20"/>
+          </w:rPr>
+          <w:t xml:space="preserve"> </w:t>
+        </w:r>
+        <w:r>
+          <w:rPr>
             <w:rFonts w:cs="Arial"/>
             <w:color w:val="215868" w:themeColor="accent5" w:themeShade="80"/>
             <w:sz w:val="20"/>
@@ -227,19 +235,18 @@
       </w:r>
       <w:r>
         <w:rPr>
+          <w:rFonts w:ascii="Arial" w:hAnsi="Arial" w:cs="Arial"/>
+          <w:sz w:val="20"/>
+        </w:rPr>
+        <w:t xml:space="preserve">  </w:t>
+      </w:r>
+      <w:r>
+        <w:rPr>
           <w:rFonts w:cs="Arial"/>
           <w:w w:val="95"/>
           <w:sz w:val="20"/>
         </w:rPr>
         <w:t>Mobile:</w:t>
-      </w:r>
-      <w:r>
-        <w:rPr>
-          <w:rFonts w:ascii="Arial" w:hAnsi="Arial" w:cs="Arial"/>
-          <w:spacing w:val="56"/>
-          <w:sz w:val="20"/>
-        </w:rPr>
-        <w:t xml:space="preserve"> </w:t>
       </w:r>
       <w:r>
         <w:rPr>
@@ -3636,7 +3643,6 @@
         </w:rPr>
         <w:t>University</w:t>
       </w:r>
-      <w:proofErr w:type="gramStart"/>
       <w:r>
         <w:rPr>
           <w:rFonts w:cs="Arial"/>
@@ -3672,15 +3678,7 @@
           <w:rFonts w:cs="Arial"/>
           <w:sz w:val="20"/>
         </w:rPr>
-        <w:t>Punjab</w:t>
-      </w:r>
-      <w:proofErr w:type="gramEnd"/>
-      <w:r>
-        <w:rPr>
-          <w:rFonts w:cs="Arial"/>
-          <w:sz w:val="20"/>
-        </w:rPr>
-        <w:t>,</w:t>
+        <w:t>Punjab,</w:t>
       </w:r>
       <w:r>
         <w:rPr>
@@ -4414,7 +4412,6 @@
         </w:rPr>
         <w:t>%</w:t>
       </w:r>
-      <w:proofErr w:type="gramStart"/>
       <w:r>
         <w:rPr>
           <w:rFonts w:ascii="Arial" w:hAnsi="Arial" w:cs="Arial"/>
@@ -4438,7 +4435,6 @@
         </w:rPr>
         <w:t>April</w:t>
       </w:r>
-      <w:proofErr w:type="gramEnd"/>
       <w:r>
         <w:rPr>
           <w:rFonts w:ascii="Arial" w:hAnsi="Arial" w:cs="Arial"/>

</xml_diff>